<commit_message>
docs(scaps): shorten CHI_ETL figure caption to match the other sweeps
The Figure 1 caption carried the full root-cause narrative (residuals, Gummel/
Anderson/PTC, the why-it-works explanation). Trim it to a plain figure
description like the other ten captions: what the filled vs hollow diamonds are
and the one-line CBO-is-band-offset reading. The mechanism detail lives in the
scope doc and CLAUDE.md, not the partner figure caption.

Claude-Session: https://claude.ai/code/session_01WY6y69PWZFwnzBQRyNuZpS
</commit_message>
<xml_diff>
--- a/docs/partner/SolarLab_SCAPS_validation_2026-06-22.docx
+++ b/docs/partner/SolarLab_SCAPS_validation_2026-06-22.docx
@@ -2416,7 +2416,7 @@
           <wp:inline>
             <wp:extent cx="5334000" cy="3481136"/>
             <wp:effectExtent b="0" l="0" r="0" t="0"/>
-            <wp:docPr descr="ETL/PVK conduction-band offset (delta EC). The SS-states curve (purple) now spans the FULL sweep. FILLED diamonds are the genuine SS interface-states solve over the flat-band operative region (delta EC &gt;= -0.16 eV), where the purple sits directly on the transient curves — CBO is a band-offset effect, so SS approx the transient (not interface-limited). HOLLOW diamonds are the deep-CBO arm (delta EC &lt;= -0.2 eV): the 1 eV cliff collapses V_oc and destroys the junction, and the SS root there is unreachable by ANY algebraic Newton (coupled Newton best residual 4e4, decoupled Gummel 1e9, Anderson 3e9, PTC 2e9 — all &gt;&gt; tol; only a long transient settles it, to residual ~1e-2 in ~0.6 s). The SS driver’s documented behaviour is to fall back to that certified plain-transient settle; the interface states are inactive in the collapsed regime, so SS == transient and the hollow points EQUAL the f=0.53 transient (the parity config’s despike). The full-range purple curve therefore overlays the transient throughout the CBO sweep — the honest statement that on this sweep interface-states add nothing over band-offset physics." title="" id="1" name="Picture"/>
+            <wp:docPr descr="ETL/PVK conduction-band offset (delta EC). Filled purple diamonds are the genuine SS interface-states solve over the flat-band region (delta EC &gt;= -0.16 eV); hollow diamonds are the certified transient fallback over the deep-CBO arm (delta EC &lt;= -0.2 eV), where the collapsed junction is unreachable by the SS Newton. The SS curve sits on the transient throughout — CBO is a band-offset effect, so SS approx the transient (not interface-limited)." title="" id="1" name="Picture"/>
             <a:graphic>
               <a:graphicData uri="http://schemas.openxmlformats.org/drawingml/2006/picture">
                 <pic:pic>
@@ -2468,7 +2468,7 @@
         <w:t xml:space="preserve">C</w:t>
       </w:r>
       <w:r>
-        <w:t xml:space="preserve">). The SS-states curve (purple) now spans the FULL sweep. FILLED diamonds are the genuine SS interface-states solve over the flat-band operative region (delta E</w:t>
+        <w:t xml:space="preserve">). Filled purple diamonds are the genuine SS interface-states solve over the flat-band region (delta E</w:t>
       </w:r>
       <w:r>
         <w:rPr>
@@ -2480,7 +2480,7 @@
         <w:t xml:space="preserve"> </w:t>
       </w:r>
       <w:r>
-        <w:t xml:space="preserve">&gt;= -0.16 eV), where the purple sits directly on the transient curves — CBO is a band-offset effect, so SS approx the transient (not interface-limited). HOLLOW diamonds are the deep-CBO arm (delta E</w:t>
+        <w:t xml:space="preserve">&gt;= -0.16 eV); hollow diamonds are the certified transient fallback over the deep-CBO arm (delta E</w:t>
       </w:r>
       <w:r>
         <w:rPr>
@@ -2492,7 +2492,7 @@
         <w:t xml:space="preserve"> </w:t>
       </w:r>
       <w:r>
-        <w:t xml:space="preserve">&lt;= -0.2 eV): the 1 eV cliff collapses V_oc and destroys the junction, and the SS root there is unreachable by ANY algebraic Newton (coupled Newton best residual 4e4, decoupled Gummel 1e9, Anderson 3e9, PTC 2e9 — all &gt;&gt; tol; only a long transient settles it, to residual ~1e-2 in ~0.6 s). The SS driver’s documented behaviour is to fall back to that certified plain-transient settle; the interface states are inactive in the collapsed regime, so SS == transient and the hollow points EQUAL the f=0.53 transient (the parity config’s despike). The full-range purple curve therefore overlays the transient throughout the CBO sweep — the honest statement that on this sweep interface-states add nothing over band-offset physics.</w:t>
+        <w:t xml:space="preserve">&lt;= -0.2 eV), where the collapsed junction is unreachable by the SS Newton. The SS curve sits on the transient throughout — CBO is a band-offset effect, so SS approx the transient (not interface-limited).</w:t>
       </w:r>
     </w:p>
     <w:p>

</xml_diff>

<commit_message>
docs(scaps): render delta/comparison symbols as math in the CHI_ETL caption
Use inline LaTeX ($\Delta E_C$, $\geq$, $\leq$, $\approx$) so xelatex
typesets the band-offset delta and the comparison operators as real math glyphs
instead of the ASCII 'delta', '>=', '<=', 'approx'. (Inline math renders via the
LaTeX math font, sidestepping the missing-Unicode-glyph issue Helvetica Neue has
with arrows.)

Claude-Session: https://claude.ai/code/session_01WY6y69PWZFwnzBQRyNuZpS
</commit_message>
<xml_diff>
--- a/docs/partner/SolarLab_SCAPS_validation_2026-06-22.docx
+++ b/docs/partner/SolarLab_SCAPS_validation_2026-06-22.docx
@@ -2416,7 +2416,7 @@
           <wp:inline>
             <wp:extent cx="5334000" cy="3481136"/>
             <wp:effectExtent b="0" l="0" r="0" t="0"/>
-            <wp:docPr descr="ETL/PVK conduction-band offset (delta EC). Filled purple diamonds are the genuine SS interface-states solve over the flat-band region (delta EC &gt;= -0.16 eV); hollow diamonds are the certified transient fallback over the deep-CBO arm (delta EC &lt;= -0.2 eV), where the collapsed junction is unreachable by the SS Newton. The SS curve sits on the transient throughout — CBO is a band-offset effect, so SS approx the transient (not interface-limited)." title="" id="1" name="Picture"/>
+            <wp:docPr descr="ETL/PVK conduction-band offset (\Delta E_C). Filled purple diamonds are the genuine SS interface-states solve over the flat-band region (\Delta E_C \geq -0.16 eV); hollow diamonds are the certified transient fallback over the deep-CBO arm (\Delta E_C \leq -0.2 eV), where the collapsed junction is unreachable by the SS Newton. The SS curve sits on the transient throughout — CBO is a band-offset effect, so SS \approx the transient (not interface-limited)." title="" id="1" name="Picture"/>
             <a:graphic>
               <a:graphicData uri="http://schemas.openxmlformats.org/drawingml/2006/picture">
                 <pic:pic>
@@ -2459,40 +2459,120 @@
         <w:pStyle w:val="ImageCaption"/>
       </w:pPr>
       <w:r>
-        <w:t xml:space="preserve">ETL/PVK conduction-band offset (delta E</w:t>
-      </w:r>
-      <w:r>
-        <w:rPr>
-          <w:vertAlign w:val="subscript"/>
-        </w:rPr>
-        <w:t xml:space="preserve">C</w:t>
-      </w:r>
-      <w:r>
-        <w:t xml:space="preserve">). Filled purple diamonds are the genuine SS interface-states solve over the flat-band region (delta E</w:t>
-      </w:r>
-      <w:r>
-        <w:rPr>
-          <w:vertAlign w:val="subscript"/>
-        </w:rPr>
-        <w:t xml:space="preserve">C</w:t>
-      </w:r>
-      <w:r>
-        <w:t xml:space="preserve"> </w:t>
-      </w:r>
-      <w:r>
-        <w:t xml:space="preserve">&gt;= -0.16 eV); hollow diamonds are the certified transient fallback over the deep-CBO arm (delta E</w:t>
-      </w:r>
-      <w:r>
-        <w:rPr>
-          <w:vertAlign w:val="subscript"/>
-        </w:rPr>
-        <w:t xml:space="preserve">C</w:t>
-      </w:r>
-      <w:r>
-        <w:t xml:space="preserve"> </w:t>
-      </w:r>
-      <w:r>
-        <w:t xml:space="preserve">&lt;= -0.2 eV), where the collapsed junction is unreachable by the SS Newton. The SS curve sits on the transient throughout — CBO is a band-offset effect, so SS approx the transient (not interface-limited).</w:t>
+        <w:t xml:space="preserve">ETL/PVK conduction-band offset (</w:t>
+      </w:r>
+      <m:oMath>
+        <m:r>
+          <m:t>Δ</m:t>
+        </m:r>
+        <m:sSub>
+          <m:e>
+            <m:r>
+              <m:t>E</m:t>
+            </m:r>
+          </m:e>
+          <m:sub>
+            <m:r>
+              <m:t>C</m:t>
+            </m:r>
+          </m:sub>
+        </m:sSub>
+      </m:oMath>
+      <w:r>
+        <w:t xml:space="preserve">). Filled purple diamonds are the genuine SS interface-states solve over the flat-band region (</w:t>
+      </w:r>
+      <m:oMath>
+        <m:r>
+          <m:t>Δ</m:t>
+        </m:r>
+        <m:sSub>
+          <m:e>
+            <m:r>
+              <m:t>E</m:t>
+            </m:r>
+          </m:e>
+          <m:sub>
+            <m:r>
+              <m:t>C</m:t>
+            </m:r>
+          </m:sub>
+        </m:sSub>
+        <m:r>
+          <m:rPr>
+            <m:sty m:val="p"/>
+          </m:rPr>
+          <m:t>≥</m:t>
+        </m:r>
+        <m:r>
+          <m:rPr>
+            <m:sty m:val="p"/>
+          </m:rPr>
+          <m:t>−</m:t>
+        </m:r>
+        <m:r>
+          <m:t>0.16</m:t>
+        </m:r>
+      </m:oMath>
+      <w:r>
+        <w:t xml:space="preserve"> </w:t>
+      </w:r>
+      <w:r>
+        <w:t xml:space="preserve">eV); hollow diamonds are the certified transient fallback over the deep-CBO arm (</w:t>
+      </w:r>
+      <m:oMath>
+        <m:r>
+          <m:t>Δ</m:t>
+        </m:r>
+        <m:sSub>
+          <m:e>
+            <m:r>
+              <m:t>E</m:t>
+            </m:r>
+          </m:e>
+          <m:sub>
+            <m:r>
+              <m:t>C</m:t>
+            </m:r>
+          </m:sub>
+        </m:sSub>
+        <m:r>
+          <m:rPr>
+            <m:sty m:val="p"/>
+          </m:rPr>
+          <m:t>≤</m:t>
+        </m:r>
+        <m:r>
+          <m:rPr>
+            <m:sty m:val="p"/>
+          </m:rPr>
+          <m:t>−</m:t>
+        </m:r>
+        <m:r>
+          <m:t>0.2</m:t>
+        </m:r>
+      </m:oMath>
+      <w:r>
+        <w:t xml:space="preserve"> </w:t>
+      </w:r>
+      <w:r>
+        <w:t xml:space="preserve">eV), where the collapsed junction is unreachable by the SS Newton. The SS curve sits on the transient throughout — CBO is a band-offset effect, so SS</w:t>
+      </w:r>
+      <w:r>
+        <w:t xml:space="preserve"> </w:t>
+      </w:r>
+      <m:oMath>
+        <m:r>
+          <m:rPr>
+            <m:sty m:val="p"/>
+          </m:rPr>
+          <m:t>≈</m:t>
+        </m:r>
+      </m:oMath>
+      <w:r>
+        <w:t xml:space="preserve"> </w:t>
+      </w:r>
+      <w:r>
+        <w:t xml:space="preserve">the transient (not interface-limited).</w:t>
       </w:r>
     </w:p>
     <w:p>

</xml_diff>

<commit_message>
docs(scaps): fix Table 2 overflow — shrink tables to footnotesize + shorten headers
The per-sweep scorecard (Table 2) ran past the right page margin once the SS-states
column carried the '86% ok (8 SS + 6 fb)' cell. Fix: apply \footnotesize to all
longtables + tighten \tabcolsep (header-includes), shorten the headers
('SCAPS range (mV)'->'SCAPS (mV)', 'SS states'->'SS-states') and the CHI_ETL cell
('(8 SS + 6 fb)'->'(8+6fb)'). Table now fits within the text block; applies
consistently to all tables in the doc. PDF/docx re-rendered.

Claude-Session: https://claude.ai/code/session_01WY6y69PWZFwnzBQRyNuZpS
</commit_message>
<xml_diff>
--- a/docs/partner/SolarLab_SCAPS_validation_2026-06-22.docx
+++ b/docs/partner/SolarLab_SCAPS_validation_2026-06-22.docx
@@ -3326,40 +3326,40 @@
               <w:jc w:val="left"/>
             </w:pPr>
             <w:r>
-              <w:t xml:space="preserve">SCAPS range (mV)</w:t>
-            </w:r>
-          </w:p>
-        </w:tc>
-        <w:tc>
-          <w:p>
-            <w:pPr>
-              <w:pStyle w:val="Compact"/>
-              <w:jc w:val="left"/>
-            </w:pPr>
-            <w:r>
-              <w:t xml:space="preserve">f = 0.53</w:t>
-            </w:r>
-          </w:p>
-        </w:tc>
-        <w:tc>
-          <w:p>
-            <w:pPr>
-              <w:pStyle w:val="Compact"/>
-              <w:jc w:val="left"/>
-            </w:pPr>
-            <w:r>
-              <w:t xml:space="preserve">f = 0.66</w:t>
-            </w:r>
-          </w:p>
-        </w:tc>
-        <w:tc>
-          <w:p>
-            <w:pPr>
-              <w:pStyle w:val="Compact"/>
-              <w:jc w:val="left"/>
-            </w:pPr>
-            <w:r>
-              <w:t xml:space="preserve">SS states</w:t>
+              <w:t xml:space="preserve">SCAPS (mV)</w:t>
+            </w:r>
+          </w:p>
+        </w:tc>
+        <w:tc>
+          <w:p>
+            <w:pPr>
+              <w:pStyle w:val="Compact"/>
+              <w:jc w:val="left"/>
+            </w:pPr>
+            <w:r>
+              <w:t xml:space="preserve">f=0.53</w:t>
+            </w:r>
+          </w:p>
+        </w:tc>
+        <w:tc>
+          <w:p>
+            <w:pPr>
+              <w:pStyle w:val="Compact"/>
+              <w:jc w:val="left"/>
+            </w:pPr>
+            <w:r>
+              <w:t xml:space="preserve">f=0.66</w:t>
+            </w:r>
+          </w:p>
+        </w:tc>
+        <w:tc>
+          <w:p>
+            <w:pPr>
+              <w:pStyle w:val="Compact"/>
+              <w:jc w:val="left"/>
+            </w:pPr>
+            <w:r>
+              <w:t xml:space="preserve">SS-states</w:t>
             </w:r>
           </w:p>
         </w:tc>
@@ -3427,7 +3427,7 @@
               <w:jc w:val="left"/>
             </w:pPr>
             <w:r>
-              <w:t xml:space="preserve">86% ok (8 SS + 6 fb)</w:t>
+              <w:t xml:space="preserve">86% ok (8+6fb)</w:t>
             </w:r>
           </w:p>
         </w:tc>

</xml_diff>